<commit_message>
Update basisopgaven antwoorden across multiple chapters
Co-Authored-By: Claude Opus 4.6 (1M context) <noreply@anthropic.com>
</commit_message>
<xml_diff>
--- a/3.1 Hoofdstuk 1 - Markten/3.1.3 Paragraaf 3 - Toepassen/3. Oefenen/basisopgaven/3.1.3 Toepassen – basis – antwoorden.docx
+++ b/3.1 Hoofdstuk 1 - Markten/3.1.3 Paragraaf 3 - Toepassen/3. Oefenen/basisopgaven/3.1.3 Toepassen – basis – antwoorden.docx
@@ -1031,6 +1031,18 @@
           <w:szCs w:val="22"/>
         </w:rPr>
         <w:t xml:space="preserve">Teken in bron 3 de aanbodlijn van grondgebonden landbouwproducten zoals Hanny van Beek uitlegt in deel B, dus in een jaarcyclus met een goede oogst (A1) en met een slechte oogst (A2).</w:t>
+      </w:r>
+    </w:p>
+    <w:p>
+      <w:r>
+        <w:rPr>
+          <w:noProof/>
+        </w:rPr>
+        <w:pict>
+          <v:shape id="Image 1" o:spid="_x0000_i1026" type="#_x0000_t75" style="width:255.6pt;height:204pt;visibility:visible">
+            <v:imagedata r:id="rId10" o:title=""/>
+          </v:shape>
+        </w:pict>
       </w:r>
     </w:p>
     <w:p>

</xml_diff>